<commit_message>
misc. folder and files restructuring
</commit_message>
<xml_diff>
--- a/__others__/soft-skills/best-practices/soft-skills.docx
+++ b/__others__/soft-skills/best-practices/soft-skills.docx
@@ -720,7 +720,7 @@
     <w:p>
       <w:r>
         <w:pict w14:anchorId="55F24588">
-          <v:rect id="_x0000_i1049" style="width:0;height:1.5pt" o:hralign="center" o:hrstd="t" o:hr="t" fillcolor="#a0a0a0" stroked="f"/>
+          <v:rect id="_x0000_i1025" style="width:0;height:1.5pt" o:hralign="center" o:hrstd="t" o:hr="t" fillcolor="#a0a0a0" stroked="f"/>
         </w:pict>
       </w:r>
     </w:p>
@@ -906,7 +906,7 @@
     <w:p>
       <w:r>
         <w:pict w14:anchorId="4A626113">
-          <v:rect id="_x0000_i1050" style="width:0;height:1.5pt" o:hralign="center" o:hrstd="t" o:hr="t" fillcolor="#a0a0a0" stroked="f"/>
+          <v:rect id="_x0000_i1026" style="width:0;height:1.5pt" o:hralign="center" o:hrstd="t" o:hr="t" fillcolor="#a0a0a0" stroked="f"/>
         </w:pict>
       </w:r>
     </w:p>
@@ -1032,7 +1032,7 @@
     <w:p>
       <w:r>
         <w:pict w14:anchorId="3B32FA9B">
-          <v:rect id="_x0000_i1051" style="width:0;height:1.5pt" o:hralign="center" o:hrstd="t" o:hr="t" fillcolor="#a0a0a0" stroked="f"/>
+          <v:rect id="_x0000_i1027" style="width:0;height:1.5pt" o:hralign="center" o:hrstd="t" o:hr="t" fillcolor="#a0a0a0" stroked="f"/>
         </w:pict>
       </w:r>
     </w:p>
@@ -1351,7 +1351,7 @@
     <w:p>
       <w:r>
         <w:pict w14:anchorId="2DC4EAF2">
-          <v:rect id="_x0000_i1052" style="width:0;height:1.5pt" o:hralign="center" o:hrstd="t" o:hr="t" fillcolor="#a0a0a0" stroked="f"/>
+          <v:rect id="_x0000_i1028" style="width:0;height:1.5pt" o:hralign="center" o:hrstd="t" o:hr="t" fillcolor="#a0a0a0" stroked="f"/>
         </w:pict>
       </w:r>
     </w:p>
@@ -1498,6 +1498,128 @@
       </w:r>
       <w:r>
         <w:t xml:space="preserve"> more than fancy slides.</w:t>
+      </w:r>
+    </w:p>
+    <w:p/>
+    <w:p/>
+    <w:p/>
+    <w:p>
+      <w:pPr>
+        <w:rPr>
+          <w:b/>
+          <w:bCs/>
+        </w:rPr>
+      </w:pPr>
+      <w:r>
+        <w:rPr>
+          <w:b/>
+          <w:bCs/>
+        </w:rPr>
+        <w:t>Tasks - Improvements</w:t>
+      </w:r>
+    </w:p>
+    <w:p>
+      <w:pPr>
+        <w:numPr>
+          <w:ilvl w:val="0"/>
+          <w:numId w:val="10"/>
+        </w:numPr>
+      </w:pPr>
+      <w:r>
+        <w:t>Check QR code working</w:t>
+      </w:r>
+    </w:p>
+    <w:p>
+      <w:pPr>
+        <w:numPr>
+          <w:ilvl w:val="0"/>
+          <w:numId w:val="10"/>
+        </w:numPr>
+      </w:pPr>
+      <w:r>
+        <w:t>Add "key takeaway" slide</w:t>
+      </w:r>
+    </w:p>
+    <w:p>
+      <w:pPr>
+        <w:numPr>
+          <w:ilvl w:val="0"/>
+          <w:numId w:val="10"/>
+        </w:numPr>
+      </w:pPr>
+      <w:r>
+        <w:t>Add more real world example slides after each major topic</w:t>
+      </w:r>
+    </w:p>
+    <w:p>
+      <w:pPr>
+        <w:numPr>
+          <w:ilvl w:val="0"/>
+          <w:numId w:val="10"/>
+        </w:numPr>
+      </w:pPr>
+      <w:r>
+        <w:t>Research and ask questions to audience after 2-3 slides</w:t>
+      </w:r>
+    </w:p>
+    <w:p>
+      <w:pPr>
+        <w:numPr>
+          <w:ilvl w:val="0"/>
+          <w:numId w:val="10"/>
+        </w:numPr>
+      </w:pPr>
+      <w:r>
+        <w:t>Replace "Black" movie example with more recent movie</w:t>
+      </w:r>
+    </w:p>
+    <w:p>
+      <w:pPr>
+        <w:numPr>
+          <w:ilvl w:val="0"/>
+          <w:numId w:val="10"/>
+        </w:numPr>
+      </w:pPr>
+      <w:r>
+        <w:t>Add movies with totally different user disability type</w:t>
+      </w:r>
+    </w:p>
+    <w:p>
+      <w:pPr>
+        <w:numPr>
+          <w:ilvl w:val="0"/>
+          <w:numId w:val="10"/>
+        </w:numPr>
+      </w:pPr>
+      <w:r>
+        <w:t>Improve the demo by making it more interesting</w:t>
+      </w:r>
+    </w:p>
+    <w:p>
+      <w:pPr>
+        <w:numPr>
+          <w:ilvl w:val="0"/>
+          <w:numId w:val="10"/>
+        </w:numPr>
+      </w:pPr>
+      <w:r>
+        <w:t>Find a good professional presentation template instead using the company</w:t>
+      </w:r>
+    </w:p>
+    <w:p>
+      <w:pPr>
+        <w:numPr>
+          <w:ilvl w:val="0"/>
+          <w:numId w:val="10"/>
+        </w:numPr>
+      </w:pPr>
+      <w:r>
+        <w:t>Add listening to radio during traveling in hobbies</w:t>
+      </w:r>
+    </w:p>
+    <w:p>
+      <w:r>
+        <w:t>presentation - break after 2 session, change seats of each other after break</w:t>
       </w:r>
     </w:p>
     <w:p/>
@@ -2259,6 +2381,155 @@
     </w:lvl>
   </w:abstractNum>
   <w:abstractNum w:abstractNumId="5" w15:restartNumberingAfterBreak="0">
+    <w:nsid w:val="5DAE363C"/>
+    <w:multiLevelType w:val="multilevel"/>
+    <w:tmpl w:val="A0A2D260"/>
+    <w:lvl w:ilvl="0">
+      <w:start w:val="1"/>
+      <w:numFmt w:val="bullet"/>
+      <w:lvlText w:val=""/>
+      <w:lvlJc w:val="left"/>
+      <w:pPr>
+        <w:tabs>
+          <w:tab w:val="num" w:pos="720"/>
+        </w:tabs>
+        <w:ind w:left="720" w:hanging="360"/>
+      </w:pPr>
+      <w:rPr>
+        <w:rFonts w:ascii="Symbol" w:hAnsi="Symbol" w:hint="default"/>
+        <w:sz w:val="20"/>
+      </w:rPr>
+    </w:lvl>
+    <w:lvl w:ilvl="1" w:tentative="1">
+      <w:start w:val="1"/>
+      <w:numFmt w:val="bullet"/>
+      <w:lvlText w:val="o"/>
+      <w:lvlJc w:val="left"/>
+      <w:pPr>
+        <w:tabs>
+          <w:tab w:val="num" w:pos="1440"/>
+        </w:tabs>
+        <w:ind w:left="1440" w:hanging="360"/>
+      </w:pPr>
+      <w:rPr>
+        <w:rFonts w:ascii="Courier New" w:hAnsi="Courier New" w:hint="default"/>
+        <w:sz w:val="20"/>
+      </w:rPr>
+    </w:lvl>
+    <w:lvl w:ilvl="2" w:tentative="1">
+      <w:start w:val="1"/>
+      <w:numFmt w:val="bullet"/>
+      <w:lvlText w:val=""/>
+      <w:lvlJc w:val="left"/>
+      <w:pPr>
+        <w:tabs>
+          <w:tab w:val="num" w:pos="2160"/>
+        </w:tabs>
+        <w:ind w:left="2160" w:hanging="360"/>
+      </w:pPr>
+      <w:rPr>
+        <w:rFonts w:ascii="Wingdings" w:hAnsi="Wingdings" w:hint="default"/>
+        <w:sz w:val="20"/>
+      </w:rPr>
+    </w:lvl>
+    <w:lvl w:ilvl="3" w:tentative="1">
+      <w:start w:val="1"/>
+      <w:numFmt w:val="bullet"/>
+      <w:lvlText w:val=""/>
+      <w:lvlJc w:val="left"/>
+      <w:pPr>
+        <w:tabs>
+          <w:tab w:val="num" w:pos="2880"/>
+        </w:tabs>
+        <w:ind w:left="2880" w:hanging="360"/>
+      </w:pPr>
+      <w:rPr>
+        <w:rFonts w:ascii="Wingdings" w:hAnsi="Wingdings" w:hint="default"/>
+        <w:sz w:val="20"/>
+      </w:rPr>
+    </w:lvl>
+    <w:lvl w:ilvl="4" w:tentative="1">
+      <w:start w:val="1"/>
+      <w:numFmt w:val="bullet"/>
+      <w:lvlText w:val=""/>
+      <w:lvlJc w:val="left"/>
+      <w:pPr>
+        <w:tabs>
+          <w:tab w:val="num" w:pos="3600"/>
+        </w:tabs>
+        <w:ind w:left="3600" w:hanging="360"/>
+      </w:pPr>
+      <w:rPr>
+        <w:rFonts w:ascii="Wingdings" w:hAnsi="Wingdings" w:hint="default"/>
+        <w:sz w:val="20"/>
+      </w:rPr>
+    </w:lvl>
+    <w:lvl w:ilvl="5" w:tentative="1">
+      <w:start w:val="1"/>
+      <w:numFmt w:val="bullet"/>
+      <w:lvlText w:val=""/>
+      <w:lvlJc w:val="left"/>
+      <w:pPr>
+        <w:tabs>
+          <w:tab w:val="num" w:pos="4320"/>
+        </w:tabs>
+        <w:ind w:left="4320" w:hanging="360"/>
+      </w:pPr>
+      <w:rPr>
+        <w:rFonts w:ascii="Wingdings" w:hAnsi="Wingdings" w:hint="default"/>
+        <w:sz w:val="20"/>
+      </w:rPr>
+    </w:lvl>
+    <w:lvl w:ilvl="6" w:tentative="1">
+      <w:start w:val="1"/>
+      <w:numFmt w:val="bullet"/>
+      <w:lvlText w:val=""/>
+      <w:lvlJc w:val="left"/>
+      <w:pPr>
+        <w:tabs>
+          <w:tab w:val="num" w:pos="5040"/>
+        </w:tabs>
+        <w:ind w:left="5040" w:hanging="360"/>
+      </w:pPr>
+      <w:rPr>
+        <w:rFonts w:ascii="Wingdings" w:hAnsi="Wingdings" w:hint="default"/>
+        <w:sz w:val="20"/>
+      </w:rPr>
+    </w:lvl>
+    <w:lvl w:ilvl="7" w:tentative="1">
+      <w:start w:val="1"/>
+      <w:numFmt w:val="bullet"/>
+      <w:lvlText w:val=""/>
+      <w:lvlJc w:val="left"/>
+      <w:pPr>
+        <w:tabs>
+          <w:tab w:val="num" w:pos="5760"/>
+        </w:tabs>
+        <w:ind w:left="5760" w:hanging="360"/>
+      </w:pPr>
+      <w:rPr>
+        <w:rFonts w:ascii="Wingdings" w:hAnsi="Wingdings" w:hint="default"/>
+        <w:sz w:val="20"/>
+      </w:rPr>
+    </w:lvl>
+    <w:lvl w:ilvl="8" w:tentative="1">
+      <w:start w:val="1"/>
+      <w:numFmt w:val="bullet"/>
+      <w:lvlText w:val=""/>
+      <w:lvlJc w:val="left"/>
+      <w:pPr>
+        <w:tabs>
+          <w:tab w:val="num" w:pos="6480"/>
+        </w:tabs>
+        <w:ind w:left="6480" w:hanging="360"/>
+      </w:pPr>
+      <w:rPr>
+        <w:rFonts w:ascii="Wingdings" w:hAnsi="Wingdings" w:hint="default"/>
+        <w:sz w:val="20"/>
+      </w:rPr>
+    </w:lvl>
+  </w:abstractNum>
+  <w:abstractNum w:abstractNumId="6" w15:restartNumberingAfterBreak="0">
     <w:nsid w:val="619F5181"/>
     <w:multiLevelType w:val="multilevel"/>
     <w:tmpl w:val="2D7AF4C2"/>
@@ -2407,7 +2678,7 @@
       </w:rPr>
     </w:lvl>
   </w:abstractNum>
-  <w:abstractNum w:abstractNumId="6" w15:restartNumberingAfterBreak="0">
+  <w:abstractNum w:abstractNumId="7" w15:restartNumberingAfterBreak="0">
     <w:nsid w:val="684977F1"/>
     <w:multiLevelType w:val="hybridMultilevel"/>
     <w:tmpl w:val="6A300A0E"/>
@@ -2520,7 +2791,7 @@
       </w:rPr>
     </w:lvl>
   </w:abstractNum>
-  <w:abstractNum w:abstractNumId="7" w15:restartNumberingAfterBreak="0">
+  <w:abstractNum w:abstractNumId="8" w15:restartNumberingAfterBreak="0">
     <w:nsid w:val="779E30CE"/>
     <w:multiLevelType w:val="multilevel"/>
     <w:tmpl w:val="1450944A"/>
@@ -2669,7 +2940,7 @@
       </w:rPr>
     </w:lvl>
   </w:abstractNum>
-  <w:abstractNum w:abstractNumId="8" w15:restartNumberingAfterBreak="0">
+  <w:abstractNum w:abstractNumId="9" w15:restartNumberingAfterBreak="0">
     <w:nsid w:val="79837B1A"/>
     <w:multiLevelType w:val="multilevel"/>
     <w:tmpl w:val="E2928E02"/>
@@ -2819,16 +3090,16 @@
     </w:lvl>
   </w:abstractNum>
   <w:num w:numId="1" w16cid:durableId="1093891919">
-    <w:abstractNumId w:val="6"/>
+    <w:abstractNumId w:val="7"/>
   </w:num>
   <w:num w:numId="2" w16cid:durableId="631788184">
-    <w:abstractNumId w:val="7"/>
+    <w:abstractNumId w:val="8"/>
   </w:num>
   <w:num w:numId="3" w16cid:durableId="1103767229">
     <w:abstractNumId w:val="4"/>
   </w:num>
   <w:num w:numId="4" w16cid:durableId="589507806">
-    <w:abstractNumId w:val="5"/>
+    <w:abstractNumId w:val="6"/>
   </w:num>
   <w:num w:numId="5" w16cid:durableId="1486436745">
     <w:abstractNumId w:val="0"/>
@@ -2837,13 +3108,16 @@
     <w:abstractNumId w:val="3"/>
   </w:num>
   <w:num w:numId="7" w16cid:durableId="730084392">
-    <w:abstractNumId w:val="8"/>
+    <w:abstractNumId w:val="9"/>
   </w:num>
   <w:num w:numId="8" w16cid:durableId="2075278812">
     <w:abstractNumId w:val="2"/>
   </w:num>
   <w:num w:numId="9" w16cid:durableId="1091198812">
     <w:abstractNumId w:val="1"/>
+  </w:num>
+  <w:num w:numId="10" w16cid:durableId="751783826">
+    <w:abstractNumId w:val="5"/>
   </w:num>
 </w:numbering>
 </file>

</xml_diff>